<commit_message>
Agregamos la librería "maps"
</commit_message>
<xml_diff>
--- a/docs/quarto/reporte.docx
+++ b/docs/quarto/reporte.docx
@@ -23,7 +23,7 @@
         <w:pStyle w:val="Date"/>
       </w:pPr>
       <w:r>
-        <w:t xml:space="preserve">2025-08-15</w:t>
+        <w:t xml:space="preserve">2026-08-14</w:t>
       </w:r>
     </w:p>
     <w:sdt>
@@ -52,7 +52,7 @@
         </w:p>
       </w:sdtContent>
     </w:sdt>
-    <w:bookmarkStart w:id="20" w:name="etapa-1.-conociendo-el-negocio"/>
+    <w:bookmarkStart w:id="9" w:name="etapa-1.-conociendo-el-negocio"/>
     <w:p>
       <w:pPr>
         <w:pStyle w:val="Heading1"/>
@@ -698,7 +698,7 @@
         <w:t xml:space="preserve">$ WDR   &lt;chr&gt; "Azimutal", NA, "136", "255", "250", "181", "91", "104", "263", …</w:t>
       </w:r>
     </w:p>
-    <w:bookmarkEnd w:id="20"/>
+    <w:bookmarkEnd w:id="9"/>
     <w:sectPr>
       <w:footnotePr>
         <w:numRestart w:val="eachSect"/>
@@ -820,10 +820,10 @@
   <w:docDefaults>
     <w:rPrDefault>
       <w:rPr>
-        <w:rFonts w:asciiTheme="minorHAnsi" w:cstheme="minorBidi" w:eastAsiaTheme="minorHAnsi" w:hAnsiTheme="minorHAnsi"/>
+        <w:rFonts w:asciiTheme="minorHAnsi" w:cstheme="minorBidi" w:eastAsiaTheme="minorEastAsia" w:hAnsiTheme="minorHAnsi"/>
         <w:sz w:val="24"/>
         <w:szCs w:val="24"/>
-        <w:lang w:bidi="ar-SA" w:eastAsia="en-US" w:val="en-US"/>
+        <w:lang w:bidi="ar-SA" w:eastAsia="zh-CN" w:val="en-US"/>
       </w:rPr>
     </w:rPrDefault>
     <w:pPrDefault>
@@ -1364,13 +1364,6 @@
       </w:tblCellMar>
     </w:tblPr>
     <w:tblStylePr w:type="firstRow">
-      <w:tblPr>
-        <w:jc w:val="left"/>
-        <w:tblInd w:type="dxa" w:w="0"/>
-      </w:tblPr>
-      <w:trPr>
-        <w:jc w:val="left"/>
-      </w:trPr>
       <w:tcPr>
         <w:tcBorders>
           <w:bottom w:val="single"/>

</xml_diff>